<commit_message>
Redeploy MELI IC pack with canonical agent names (481 substitutions)
</commit_message>
<xml_diff>
--- a/memos/meli/ic-reading-pack-28-may-2026.docx
+++ b/memos/meli/ic-reading-pack-28-may-2026.docx
@@ -364,7 +364,7 @@
         <w:pStyle w:val="BodyText"/>
       </w:pPr>
       <w:r>
-        <w:t xml:space="preserve">MercadoLibre is the integrated marketplace + payments + credit + logistics + advertising platform of Latin America, compounding revenue at 42.2% over the four-year window 2021-2025 and re-accelerating to +49% YoY in Q1 2026 [workstream_d Section 2]. The wide moat is structural (Helmer 7 Powers weighted 115.7; scale economies, network economies, switching costs all load) rather than AI-exceptionalist [workstream_b moat-assessment]. At spot $1,648 the probability-weighted intrinsic is $1,632, implying -1.0% margin of safety [workstream_d Section 7]. The verdict is STARTER, not full, for two reasons. First, the bull case (which re-rates intrinsic to ~$1,925) requires AI-cohort disclosure with attribution that does not yet anchor to primary management filings [cross_red_flags RF-DISC-006]. Second, the price embeds consensus 17-19% revenue CAGR at a developed-market discount rate — the moat is real but the moat is not paying for itself in margin-of-safety terms at spot. Take a starter seat sized at $50k pending Szarfsztejn's first AI-cohort disclosure; full position only at $1,270 or below (20% MoS). The asymmetric upside is genuine; the patience cost is small.</w:t>
+        <w:t xml:space="preserve">MercadoLibre is the integrated marketplace + payments + credit + logistics + advertising platform of Latin America, compounding revenue at 42.2% over the four-year window 2021-2025 and re-accelerating to +49% YoY in Q1 2026 [Valuation Section 2]. The wide moat is structural (Helmer 7 Powers weighted 115.7; scale economies, network economies, switching costs all load) rather than AI-exceptionalist [Competitor Analysis / Voice of Customer moat-assessment]. At spot $1,648 the probability-weighted intrinsic is $1,632, implying -1.0% margin of safety [Valuation Section 7]. The verdict is STARTER, not full, for two reasons. First, the bull case (which re-rates intrinsic to ~$1,925) requires AI-cohort disclosure with attribution that does not yet anchor to primary management filings [Red Flags RF-DISC-006]. Second, the price embeds consensus 17-19% revenue CAGR at a developed-market discount rate — the moat is real but the moat is not paying for itself in margin-of-safety terms at spot. Take a starter seat sized at $50k pending Szarfsztejn's first AI-cohort disclosure; full position only at $1,270 or below (20% MoS). The asymmetric upside is genuine; the patience cost is small.</w:t>
       </w:r>
     </w:p>
     <w:bookmarkEnd w:id="14"/>
@@ -490,7 +490,7 @@
         <w:t xml:space="preserve"> </w:t>
       </w:r>
       <w:r>
-        <w:t xml:space="preserve">[T1 — cross_red_flags §RF-DISC-006]</w:t>
+        <w:t xml:space="preserve">[T1 — Red Flags §RF-DISC-006]</w:t>
       </w:r>
     </w:p>
     <w:p>
@@ -518,7 +518,7 @@
         <w:t xml:space="preserve"> </w:t>
       </w:r>
       <w:r>
-        <w:t xml:space="preserve">[T1 — workstream_b §regulatory]</w:t>
+        <w:t xml:space="preserve">[T1 — Competitor Analysis §regulatory]</w:t>
       </w:r>
     </w:p>
     <w:p>
@@ -546,7 +546,7 @@
         <w:t xml:space="preserve"> </w:t>
       </w:r>
       <w:r>
-        <w:t xml:space="preserve">[T1 — workstream_d §scenario-probability-weights]</w:t>
+        <w:t xml:space="preserve">[T1 — Valuation §scenario-probability-weights]</w:t>
       </w:r>
     </w:p>
     <w:p>
@@ -574,7 +574,7 @@
         <w:t xml:space="preserve"> </w:t>
       </w:r>
       <w:r>
-        <w:t xml:space="preserve">[T1 — workstream_e/primary-filings]</w:t>
+        <w:t xml:space="preserve">[T1 — Primary Filings]</w:t>
       </w:r>
     </w:p>
     <w:bookmarkEnd w:id="15"/>
@@ -608,7 +608,7 @@
         <w:t xml:space="preserve"> </w:t>
       </w:r>
       <w:r>
-        <w:t xml:space="preserve">[T1 — workstream_d §2]</w:t>
+        <w:t xml:space="preserve">[T1 — Valuation §2]</w:t>
       </w:r>
       <w:r>
         <w:t xml:space="preserve">, with a Q1 2026 print re-accelerating to +49% YoY — the strongest quarter since Q2 2022</w:t>
@@ -617,7 +617,7 @@
         <w:t xml:space="preserve"> </w:t>
       </w:r>
       <w:r>
-        <w:t xml:space="preserve">[T1 — workstream_d §2; 10-Q 2026-05-08]</w:t>
+        <w:t xml:space="preserve">[T1 — Valuation §2; 10-Q 2026-05-08]</w:t>
       </w:r>
       <w:r>
         <w:t xml:space="preserve">. The platform operates across 18 LatAm countries and owns first-party logistics through Mercado Envíos, licensed fintech operations through Mercado Pago and Mercado Crédito, and a fast-growing advertising arm in Mercado Ads</w:t>
@@ -626,7 +626,7 @@
         <w:t xml:space="preserve"> </w:t>
       </w:r>
       <w:r>
-        <w:t xml:space="preserve">[T1 — workstream_b/competitor-analysis §moat]</w:t>
+        <w:t xml:space="preserve">[T1 — Competitor Analysis §moat]</w:t>
       </w:r>
       <w:r>
         <w:t xml:space="preserve">.</w:t>
@@ -653,7 +653,7 @@
         <w:t xml:space="preserve"> </w:t>
       </w:r>
       <w:r>
-        <w:t xml:space="preserve">[T1 — workstream_b §moat]</w:t>
+        <w:t xml:space="preserve">[T1 — Competitor Analysis §moat]</w:t>
       </w:r>
       <w:r>
         <w:t xml:space="preserve">. The moat-durability index runs 131 versus a sector median of 100</w:t>
@@ -662,7 +662,7 @@
         <w:t xml:space="preserve"> </w:t>
       </w:r>
       <w:r>
-        <w:t xml:space="preserve">[T1 — workstream_d §5]</w:t>
+        <w:t xml:space="preserve">[T1 — Valuation §5]</w:t>
       </w:r>
       <w:r>
         <w:t xml:space="preserve">. Twenty-six years of accumulated thin-file LatAm behavioural data and a multi-billion-dollar logistics build-out across BR/MX/CL/CO are the durable physical and informational moats; the Helmer 7 Powers weighted score reads 115.7 with the moat index at 125</w:t>
@@ -671,7 +671,7 @@
         <w:t xml:space="preserve"> </w:t>
       </w:r>
       <w:r>
-        <w:t xml:space="preserve">[T1 — workstream_b §moat]</w:t>
+        <w:t xml:space="preserve">[T1 — Competitor Analysis §moat]</w:t>
       </w:r>
       <w:r>
         <w:t xml:space="preserve">.</w:t>
@@ -698,7 +698,7 @@
         <w:t xml:space="preserve"> </w:t>
       </w:r>
       <w:r>
-        <w:t xml:space="preserve">[T1 — workstream_d §1]</w:t>
+        <w:t xml:space="preserve">[T1 — Valuation §1]</w:t>
       </w:r>
       <w:r>
         <w:t xml:space="preserve">, MercadoLibre trades at a probability-weighted intrinsic of $1,632 — a margin of safety of −1.0%</w:t>
@@ -707,7 +707,7 @@
         <w:t xml:space="preserve"> </w:t>
       </w:r>
       <w:r>
-        <w:t xml:space="preserve">[T1 — workstream_d §7]</w:t>
+        <w:t xml:space="preserve">[T1 — Valuation §7]</w:t>
       </w:r>
       <w:r>
         <w:t xml:space="preserve">. The 4-year revenue compound is exceptional and the Q1'26 reacceleration is real. But the price embeds a consensus 17–18% revenue CAGR over five years at a developed-market discount rate, and the AI narrative the company invokes to defend the margin-expansion path does not yet anchor to audited cohort disclosure.</w:t>
@@ -726,13 +726,13 @@
         <w:pStyle w:val="BodyText"/>
       </w:pPr>
       <w:r>
-        <w:t xml:space="preserve">Workstream A grades zero of MercadoLibre's six AI deployments at evidence grade B or better. The three load-bearing AI claims the bull thesis relies on — Mercado Pago's 87% AI customer-service resolution rate, Mercado Crédito's 23.3% NIMAL, and the 40% YoY fraud-cost decline — are sourced from secondary synthesis (klover.ai, investing.com, Gate 6 reference), not primary management disclosure</w:t>
-      </w:r>
-      <w:r>
-        <w:t xml:space="preserve"> </w:t>
-      </w:r>
-      <w:r>
-        <w:t xml:space="preserve">[T1 — cross_red_flags §RF-DISC-006]</w:t>
+        <w:t xml:space="preserve">The AI Unit Economics agent grades zero of MercadoLibre's six AI deployments at evidence grade B or better. The three load-bearing AI claims the bull thesis relies on — Mercado Pago's 87% AI customer-service resolution rate, Mercado Crédito's 23.3% NIMAL, and the 40% YoY fraud-cost decline — are sourced from secondary synthesis (klover.ai, investing.com, Gate 6 reference), not primary management disclosure</w:t>
+      </w:r>
+      <w:r>
+        <w:t xml:space="preserve"> </w:t>
+      </w:r>
+      <w:r>
+        <w:t xml:space="preserve">[T1 — Red Flags §RF-DISC-006]</w:t>
       </w:r>
       <w:r>
         <w:t xml:space="preserve">. This fires the one high-severity flag in a 9-flag sweep across an 86-flag canonical catalogue. It is the canonical Schilit "reliance on adjusted financial metrics" pattern, inverted into modern AI-narrative form.</w:t>
@@ -884,7 +884,7 @@
               <w:pStyle w:val="Compact"/>
             </w:pPr>
             <w:r>
-              <w:t xml:space="preserve">[T1 — workstream_a §events; 10-K FY2025]</w:t>
+              <w:t xml:space="preserve">[T1 — Company History §events; 10-K FY2025]</w:t>
             </w:r>
           </w:p>
         </w:tc>
@@ -919,7 +919,7 @@
               <w:pStyle w:val="Compact"/>
             </w:pPr>
             <w:r>
-              <w:t xml:space="preserve">[T1 — workstream_a §events]</w:t>
+              <w:t xml:space="preserve">[T1 — Company History §events]</w:t>
             </w:r>
           </w:p>
         </w:tc>
@@ -954,7 +954,7 @@
               <w:pStyle w:val="Compact"/>
             </w:pPr>
             <w:r>
-              <w:t xml:space="preserve">[T1 — workstream_a §events; SEC 424B1]</w:t>
+              <w:t xml:space="preserve">[T1 — Company History §events; SEC 424B1]</w:t>
             </w:r>
           </w:p>
         </w:tc>
@@ -989,7 +989,7 @@
               <w:pStyle w:val="Compact"/>
             </w:pPr>
             <w:r>
-              <w:t xml:space="preserve">[T1 — workstream_a §events]</w:t>
+              <w:t xml:space="preserve">[T1 — Company History §events]</w:t>
             </w:r>
           </w:p>
         </w:tc>
@@ -1024,7 +1024,7 @@
               <w:pStyle w:val="Compact"/>
             </w:pPr>
             <w:r>
-              <w:t xml:space="preserve">[T1 — workstream_a §events; DEF 14A]</w:t>
+              <w:t xml:space="preserve">[T1 — Company History §events; DEF 14A]</w:t>
             </w:r>
           </w:p>
         </w:tc>
@@ -1067,7 +1067,7 @@
         <w:t xml:space="preserve"> </w:t>
       </w:r>
       <w:r>
-        <w:t xml:space="preserve">[T1 — workstream_b §MC-01; 10-K]</w:t>
+        <w:t xml:space="preserve">[T1 — Voice of Customer §MC-01; 10-K]</w:t>
       </w:r>
       <w:r>
         <w:t xml:space="preserve">.</w:t>
@@ -1124,7 +1124,7 @@
         <w:t xml:space="preserve"> </w:t>
       </w:r>
       <w:r>
-        <w:t xml:space="preserve">[T1 — workstream_a §dep-004; BusinessWire 2026-02-24]</w:t>
+        <w:t xml:space="preserve">[T1 — AI Unit Economics §dep-004; BusinessWire 2026-02-24]</w:t>
       </w:r>
       <w:r>
         <w:t xml:space="preserve">.</w:t>
@@ -1149,7 +1149,7 @@
         <w:t xml:space="preserve"> </w:t>
       </w:r>
       <w:r>
-        <w:t xml:space="preserve">[T3 — workstream_a §dep-003]</w:t>
+        <w:t xml:space="preserve">[T3 — AI Unit Economics §dep-003]</w:t>
       </w:r>
       <w:r>
         <w:t xml:space="preserve">.</w:t>
@@ -1294,7 +1294,7 @@
         <w:t xml:space="preserve"> </w:t>
       </w:r>
       <w:r>
-        <w:t xml:space="preserve">[T1 — cross_red_flags §RF-AUD-001]</w:t>
+        <w:t xml:space="preserve">[T1 — Red Flags §RF-AUD-001]</w:t>
       </w:r>
     </w:p>
     <w:p>
@@ -1350,7 +1350,7 @@
         <w:t xml:space="preserve"> </w:t>
       </w:r>
       <w:r>
-        <w:t xml:space="preserve">[T1 — workstream_a §events; 10-K]</w:t>
+        <w:t xml:space="preserve">[T1 — Company History §events; 10-K]</w:t>
       </w:r>
     </w:p>
     <w:p>
@@ -1397,7 +1397,7 @@
         <w:t xml:space="preserve"> </w:t>
       </w:r>
       <w:r>
-        <w:t xml:space="preserve">[T2 — workstream_b §substitutes]</w:t>
+        <w:t xml:space="preserve">[T2 — Competitor Analysis §substitutes]</w:t>
       </w:r>
       <w:r>
         <w:t xml:space="preserve">. The penetration gap is the load-bearing argument. Closing half of it over a decade is consistent with the consensus 17–19% revenue CAGR the current price embeds in the reverse-DCF</w:t>
@@ -1406,7 +1406,7 @@
         <w:t xml:space="preserve"> </w:t>
       </w:r>
       <w:r>
-        <w:t xml:space="preserve">[T1 — workstream_d §reverse-DCF]</w:t>
+        <w:t xml:space="preserve">[T1 — Valuation §reverse-DCF]</w:t>
       </w:r>
       <w:r>
         <w:t xml:space="preserve">.</w:t>
@@ -1446,7 +1446,7 @@
         <w:t xml:space="preserve"> </w:t>
       </w:r>
       <w:r>
-        <w:t xml:space="preserve">[inference — workstream_d §WACC build]</w:t>
+        <w:t xml:space="preserve">[inference — Valuation §WACC build]</w:t>
       </w:r>
       <w:r>
         <w:t xml:space="preserve">.</w:t>
@@ -1477,7 +1477,7 @@
         <w:t xml:space="preserve"> </w:t>
       </w:r>
       <w:r>
-        <w:t xml:space="preserve">[T2 — workstream_b §direct-competitor]</w:t>
+        <w:t xml:space="preserve">[T2 — Competitor Analysis §direct-competitor]</w:t>
       </w:r>
       <w:r>
         <w:t xml:space="preserve">.</w:t>
@@ -1508,7 +1508,7 @@
         <w:t xml:space="preserve"> </w:t>
       </w:r>
       <w:r>
-        <w:t xml:space="preserve">[T1 — workstream_b §EM-native-moat]</w:t>
+        <w:t xml:space="preserve">[T1 — Competitor Analysis §EM-native-moat]</w:t>
       </w:r>
       <w:r>
         <w:t xml:space="preserve">.</w:t>
@@ -1535,7 +1535,7 @@
         <w:t xml:space="preserve"> </w:t>
       </w:r>
       <w:r>
-        <w:t xml:space="preserve">[T1 — workstream_d §2]</w:t>
+        <w:t xml:space="preserve">[T1 — Valuation §2]</w:t>
       </w:r>
       <w:r>
         <w:t xml:space="preserve"> </w:t>
@@ -1547,7 +1547,7 @@
         <w:t xml:space="preserve"> </w:t>
       </w:r>
       <w:r>
-        <w:t xml:space="preserve">[T1 — workstream_d §2]</w:t>
+        <w:t xml:space="preserve">[T1 — Valuation §2]</w:t>
       </w:r>
       <w:r>
         <w:t xml:space="preserve"> </w:t>
@@ -1567,7 +1567,7 @@
         <w:t xml:space="preserve"> </w:t>
       </w:r>
       <w:r>
-        <w:t xml:space="preserve">[T2 — workstream_d §3]</w:t>
+        <w:t xml:space="preserve">[T2 — Valuation §3]</w:t>
       </w:r>
       <w:r>
         <w:t xml:space="preserve">. Amazon, the global integrated-commerce reference, grew 13.6% TTM. MELI's Q1 2026 +49% is above both. The reference-class base rate is therefore a wide band: 14% (Amazon) at the mature end, 38% (Sea) at the comparable end, 49% (MELI Q1) at the recent print. Consensus models 17–19% revenue CAGR over five years</w:t>
@@ -1576,7 +1576,7 @@
         <w:t xml:space="preserve"> </w:t>
       </w:r>
       <w:r>
-        <w:t xml:space="preserve">[T2 — workstream_g §bull-framing]</w:t>
+        <w:t xml:space="preserve">[T2 — Analyst Coverage §bull-framing]</w:t>
       </w:r>
       <w:r>
         <w:t xml:space="preserve">; our base case adopts a similar trajectory.</w:t>
@@ -1635,7 +1635,7 @@
         <w:t xml:space="preserve"> </w:t>
       </w:r>
       <w:r>
-        <w:t xml:space="preserve">[T1 — workstream_b §direct-competitor]</w:t>
+        <w:t xml:space="preserve">[T1 — Competitor Analysis §direct-competitor]</w:t>
       </w:r>
       <w:r>
         <w:t xml:space="preserve">. The war-game scenario — Shopee accelerates LatAm seller subsidies funded by SE-Asia cashflows while Nubank expands Brazil/Mexico consumer credit at lower rates than Mercado Crédito — is the central bear-case mechanism in the valuation</w:t>
@@ -1644,7 +1644,7 @@
         <w:t xml:space="preserve"> </w:t>
       </w:r>
       <w:r>
-        <w:t xml:space="preserve">[T1 — workstream_b §war-game]</w:t>
+        <w:t xml:space="preserve">[T1 — Competitor Analysis §war-game]</w:t>
       </w:r>
       <w:r>
         <w:t xml:space="preserve">. It is the most concrete take-rate-compression path from 20–22% to 17–18%, the band that drives MELI's bear-case intrinsic of $623/share</w:t>
@@ -1653,7 +1653,7 @@
         <w:t xml:space="preserve"> </w:t>
       </w:r>
       <w:r>
-        <w:t xml:space="preserve">[T1 — workstream_d §6]</w:t>
+        <w:t xml:space="preserve">[T1 — Valuation §6]</w:t>
       </w:r>
       <w:r>
         <w:t xml:space="preserve">.</w:t>
@@ -1680,7 +1680,7 @@
         <w:t xml:space="preserve"> </w:t>
       </w:r>
       <w:r>
-        <w:t xml:space="preserve">[T2 — workstream_b §direct-competitor]</w:t>
+        <w:t xml:space="preserve">[T2 — Competitor Analysis §direct-competitor]</w:t>
       </w:r>
       <w:r>
         <w:t xml:space="preserve">. Amazon's mature US ad-revenue-to-GMV ratio runs 7–8%</w:t>
@@ -1689,7 +1689,7 @@
         <w:t xml:space="preserve"> </w:t>
       </w:r>
       <w:r>
-        <w:t xml:space="preserve">[T2 — workstream_a §dep-003]</w:t>
+        <w:t xml:space="preserve">[T2 — AI Unit Economics §dep-003]</w:t>
       </w:r>
       <w:r>
         <w:t xml:space="preserve">, versus MELI's ~2% — meaningful headroom, but Amazon must execute LatAm-specific logistics density to capture it.</w:t>
@@ -1716,7 +1716,7 @@
         <w:t xml:space="preserve"> </w:t>
       </w:r>
       <w:r>
-        <w:t xml:space="preserve">[T2 — workstream_b §direct-competitor]</w:t>
+        <w:t xml:space="preserve">[T2 — Competitor Analysis §direct-competitor]</w:t>
       </w:r>
       <w:r>
         <w:t xml:space="preserve">. Where Mercado Crédito earns its margin on platform-data-enabled thin-file underwriting, Nubank earns its margin on regulated-bank cost-of-funds advantage. The two coexist today; the question is whether Nubank's bank-rate funding advantage erodes Mercado Crédito's NIMAL over time.</w:t>
@@ -1743,7 +1743,7 @@
         <w:t xml:space="preserve"> </w:t>
       </w:r>
       <w:r>
-        <w:t xml:space="preserve">[T1 — workstream_b §moat]</w:t>
+        <w:t xml:space="preserve">[T1 — Competitor Analysis §moat]</w:t>
       </w:r>
       <w:r>
         <w:t xml:space="preserve">. Three powers load:</w:t>
@@ -1774,7 +1774,7 @@
         <w:t xml:space="preserve"> </w:t>
       </w:r>
       <w:r>
-        <w:t xml:space="preserve">[T1 — workstream_b §moat; BusinessWire 2026-02-24]</w:t>
+        <w:t xml:space="preserve">[T1 — Competitor Analysis §moat; BusinessWire 2026-02-24]</w:t>
       </w:r>
       <w:r>
         <w:t xml:space="preserve">. Management explicitly attributes the decline to scale.</w:t>
@@ -1805,7 +1805,7 @@
         <w:t xml:space="preserve"> </w:t>
       </w:r>
       <w:r>
-        <w:t xml:space="preserve">[T1 — workstream_b §moat]</w:t>
+        <w:t xml:space="preserve">[T1 — Competitor Analysis §moat]</w:t>
       </w:r>
       <w:r>
         <w:t xml:space="preserve">.</w:t>
@@ -1836,7 +1836,7 @@
         <w:t xml:space="preserve"> </w:t>
       </w:r>
       <w:r>
-        <w:t xml:space="preserve">[T1 — workstream_b §moat; 10-K]</w:t>
+        <w:t xml:space="preserve">[T1 — Competitor Analysis §moat; 10-K]</w:t>
       </w:r>
       <w:r>
         <w:t xml:space="preserve">.</w:t>
@@ -1853,7 +1853,7 @@
         <w:t xml:space="preserve"> </w:t>
       </w:r>
       <w:r>
-        <w:t xml:space="preserve">[T2 — workstream_b §moat]</w:t>
+        <w:t xml:space="preserve">[T2 — Competitor Analysis §moat]</w:t>
       </w:r>
       <w:r>
         <w:t xml:space="preserve">. Cornered resource scores 95 — 26 years of accumulated thin-file LatAm behavioural data is replicable with time, not legally protected.</w:t>
@@ -1888,7 +1888,7 @@
         <w:t xml:space="preserve"> </w:t>
       </w:r>
       <w:r>
-        <w:t xml:space="preserve">[T4 — workstream_b/voice-of-customer §run-level-finding]</w:t>
+        <w:t xml:space="preserve">[T4 — Voice of Customer §run-level-finding]</w:t>
       </w:r>
       <w:r>
         <w:t xml:space="preserve">. Four candidate themes appear as colour signal only: (i) take rate at the pain threshold (seller discourse frames combined marketplace + Envíos + Pago fees as already margin-crushing); (ii) trust-and-safety dispersion in electronics/apparel/cosmetics (the categories MELI most needs to defend); (iii) Mercado Pago friction (account locks, KYC freezes, dispute delays); (iv) logistics expectations as a liability (FULL branding raises user expectations to Amazon Prime levels). None promoted to load-bearing finding.</w:t>
@@ -1989,7 +1989,7 @@
               <w:t xml:space="preserve"> </w:t>
             </w:r>
             <w:r>
-              <w:t xml:space="preserve">[T1 — workstream_b §regulatory]</w:t>
+              <w:t xml:space="preserve">[T1 — Competitor Analysis §regulatory]</w:t>
             </w:r>
           </w:p>
         </w:tc>
@@ -2030,7 +2030,7 @@
               <w:t xml:space="preserve"> </w:t>
             </w:r>
             <w:r>
-              <w:t xml:space="preserve">[T1 — workstream_b §regulatory]</w:t>
+              <w:t xml:space="preserve">[T1 — Competitor Analysis §regulatory]</w:t>
             </w:r>
           </w:p>
         </w:tc>
@@ -2071,7 +2071,7 @@
               <w:t xml:space="preserve"> </w:t>
             </w:r>
             <w:r>
-              <w:t xml:space="preserve">[T1 — workstream_b §regulatory]</w:t>
+              <w:t xml:space="preserve">[T1 — Competitor Analysis §regulatory]</w:t>
             </w:r>
           </w:p>
         </w:tc>
@@ -2112,7 +2112,7 @@
               <w:t xml:space="preserve"> </w:t>
             </w:r>
             <w:r>
-              <w:t xml:space="preserve">[T1 — workstream_b §regulatory]</w:t>
+              <w:t xml:space="preserve">[T1 — Competitor Analysis §regulatory]</w:t>
             </w:r>
           </w:p>
         </w:tc>
@@ -2161,7 +2161,7 @@
         <w:t xml:space="preserve"> </w:t>
       </w:r>
       <w:r>
-        <w:t xml:space="preserve">[T2 — workstream_c §founder-transition]</w:t>
+        <w:t xml:space="preserve">[T2 — People &amp; Culture §founder-transition]</w:t>
       </w:r>
       <w:r>
         <w:t xml:space="preserve">. He announced on 21 May 2025 that he would step down as CEO effective 31 December 2025 and assume the Executive Chairman role from 1 January 2026, with Ariel Szarfsztejn promoted from Commerce President to CEO and President on the same date</w:t>
@@ -2170,7 +2170,7 @@
         <w:t xml:space="preserve"> </w:t>
       </w:r>
       <w:r>
-        <w:t xml:space="preserve">[T2 — workstream_c; corroborated DEF 14A 2026-04-23]</w:t>
+        <w:t xml:space="preserve">[T2 — People &amp; Culture; corroborated DEF 14A 2026-04-23]</w:t>
       </w:r>
       <w:r>
         <w:t xml:space="preserve">.</w:t>
@@ -2187,7 +2187,7 @@
         <w:t xml:space="preserve"> </w:t>
       </w:r>
       <w:r>
-        <w:t xml:space="preserve">[T3 — workstream_c §founder-transition]</w:t>
+        <w:t xml:space="preserve">[T3 — People &amp; Culture §founder-transition]</w:t>
       </w:r>
       <w:r>
         <w:t xml:space="preserve">. This is a Wasserman-textbook founder-role-sacrifice transition (Marker D), executed before pressure required it: governance, succession, and equity-control questions handed off voluntarily by a founder still well within operating prime. The founder-courage marker scores ~110 on the 100-equals-peer-median index</w:t>
@@ -2196,7 +2196,7 @@
         <w:t xml:space="preserve"> </w:t>
       </w:r>
       <w:r>
-        <w:t xml:space="preserve">[inference — workstream_c]</w:t>
+        <w:t xml:space="preserve">[inference — People &amp; Culture]</w:t>
       </w:r>
       <w:r>
         <w:t xml:space="preserve">.</w:t>
@@ -2223,7 +2223,7 @@
         <w:t xml:space="preserve"> </w:t>
       </w:r>
       <w:r>
-        <w:t xml:space="preserve">[T2 — workstream_c]</w:t>
+        <w:t xml:space="preserve">[T2 — People &amp; Culture]</w:t>
       </w:r>
       <w:r>
         <w:t xml:space="preserve">. Pre-MELI he was at Despegar (LatAm online travel) and Boston Consulting Group</w:t>
@@ -2258,7 +2258,7 @@
         <w:t xml:space="preserve"> </w:t>
       </w:r>
       <w:r>
-        <w:t xml:space="preserve">[T3 — workstream_c §compensation]</w:t>
+        <w:t xml:space="preserve">[T3 — People &amp; Culture §compensation]</w:t>
       </w:r>
       <w:r>
         <w:t xml:space="preserve">. Direct equity ownership is very small at approximately 0.0001% of shares outstanding</w:t>
@@ -2267,7 +2267,7 @@
         <w:t xml:space="preserve"> </w:t>
       </w:r>
       <w:r>
-        <w:t xml:space="preserve">[T3 — workstream_c]</w:t>
+        <w:t xml:space="preserve">[T3 — People &amp; Culture]</w:t>
       </w:r>
       <w:r>
         <w:t xml:space="preserve">. The compensation structure is conventional listed-equity professional-CEO design, heavily skewed to stock-linked variable pay — alignment is via grant value, not founder-level equity.</w:t>
@@ -2284,7 +2284,7 @@
         <w:t xml:space="preserve"> </w:t>
       </w:r>
       <w:r>
-        <w:t xml:space="preserve">[inference — workstream_c]</w:t>
+        <w:t xml:space="preserve">[inference — People &amp; Culture]</w:t>
       </w:r>
       <w:r>
         <w:t xml:space="preserve">. The logistics build-out is independently corroborated as a moat driver</w:t>
@@ -2330,7 +2330,7 @@
         <w:t xml:space="preserve"> </w:t>
       </w:r>
       <w:r>
-        <w:t xml:space="preserve">[T2 — workstream_c §bench]</w:t>
+        <w:t xml:space="preserve">[T2 — People &amp; Culture §bench]</w:t>
       </w:r>
       <w:r>
         <w:t xml:space="preserve">. Twenty-six continuous years at the platform, owning the engineering and product stack across the AI deployment effort. No prior AI-lab affiliation</w:t>
@@ -2366,7 +2366,7 @@
         <w:t xml:space="preserve"> </w:t>
       </w:r>
       <w:r>
-        <w:t xml:space="preserve">[T2 — workstream_c]</w:t>
+        <w:t xml:space="preserve">[T2 — People &amp; Culture]</w:t>
       </w:r>
       <w:r>
         <w:t xml:space="preserve">. Running Crédito put him at the centre of the data-and-risk-modelling stack that underwrites the fintech monetisation thesis.</w:t>
@@ -2393,7 +2393,7 @@
         <w:t xml:space="preserve"> </w:t>
       </w:r>
       <w:r>
-        <w:t xml:space="preserve">[T2 — workstream_c]</w:t>
+        <w:t xml:space="preserve">[T2 — People &amp; Culture]</w:t>
       </w:r>
       <w:r>
         <w:t xml:space="preserve">.</w:t>
@@ -2410,7 +2410,7 @@
         <w:t xml:space="preserve"> </w:t>
       </w:r>
       <w:r>
-        <w:t xml:space="preserve">[T2 — workstream_c]</w:t>
+        <w:t xml:space="preserve">[T2 — People &amp; Culture]</w:t>
       </w:r>
       <w:r>
         <w:t xml:space="preserve">. Median shared tenure across the named team is unusually high — at least four of the seven named EVPs have been at MELI for more than 10 years.</w:t>
@@ -2437,7 +2437,7 @@
         <w:t xml:space="preserve"> </w:t>
       </w:r>
       <w:r>
-        <w:t xml:space="preserve">[T2 — workstream_c §key-person-risk]</w:t>
+        <w:t xml:space="preserve">[T2 — People &amp; Culture §key-person-risk]</w:t>
       </w:r>
       <w:r>
         <w:t xml:space="preserve">.</w:t>
@@ -2464,7 +2464,7 @@
         <w:t xml:space="preserve"> </w:t>
       </w:r>
       <w:r>
-        <w:t xml:space="preserve">[T3 — workstream_c §culture]</w:t>
+        <w:t xml:space="preserve">[T3 — People &amp; Culture §culture]</w:t>
       </w:r>
       <w:r>
         <w:t xml:space="preserve">. Trailing-12-month delta not extractable from current sources</w:t>
@@ -2490,7 +2490,7 @@
         <w:t xml:space="preserve"> </w:t>
       </w:r>
       <w:r>
-        <w:t xml:space="preserve">[T3 — workstream_c; AS/COA 2024 talk]</w:t>
+        <w:t xml:space="preserve">[T3 — People &amp; Culture; AS/COA 2024 talk]</w:t>
       </w:r>
       <w:r>
         <w:t xml:space="preserve">. No headline hires from OpenAI, Anthropic, DeepMind, or peer AI labs into C-suite or named EVP roles are evident in the sources</w:t>
@@ -2499,7 +2499,7 @@
         <w:t xml:space="preserve"> </w:t>
       </w:r>
       <w:r>
-        <w:t xml:space="preserve">[T2 — workstream_c]</w:t>
+        <w:t xml:space="preserve">[T2 — People &amp; Culture]</w:t>
       </w:r>
       <w:r>
         <w:t xml:space="preserve">. No board director carries a primary AI-research or AI-engineering identity — Dubugras (Brex) is the closest fintech-tech founder profile, and Tolda brings deep e-commerce operating depth, but AI sits entirely inside management</w:t>
@@ -2508,7 +2508,7 @@
         <w:t xml:space="preserve"> </w:t>
       </w:r>
       <w:r>
-        <w:t xml:space="preserve">[T2 — workstream_c §board]</w:t>
+        <w:t xml:space="preserve">[T2 — People &amp; Culture §board]</w:t>
       </w:r>
       <w:r>
         <w:t xml:space="preserve">.</w:t>
@@ -3074,7 +3074,7 @@
         <w:t xml:space="preserve"> </w:t>
       </w:r>
       <w:r>
-        <w:t xml:space="preserve">[T1 — workstream_d §2; EODHD Income Statement; MELI 10-K filings 2026-02-25 for FY25]</w:t>
+        <w:t xml:space="preserve">[T1 — Valuation §2; EODHD Income Statement; MELI 10-K filings 2026-02-25 for FY25]</w:t>
       </w:r>
     </w:p>
     <w:p>
@@ -3098,7 +3098,7 @@
         <w:t xml:space="preserve"> </w:t>
       </w:r>
       <w:r>
-        <w:t xml:space="preserve">[T1 — workstream_d §2; 10-Q 2026-05-08]</w:t>
+        <w:t xml:space="preserve">[T1 — Valuation §2; 10-Q 2026-05-08]</w:t>
       </w:r>
       <w:r>
         <w:t xml:space="preserve">.</w:t>
@@ -3125,7 +3125,7 @@
         <w:t xml:space="preserve"> </w:t>
       </w:r>
       <w:r>
-        <w:t xml:space="preserve">[T1 — workstream_d §2]</w:t>
+        <w:t xml:space="preserve">[T1 — Valuation §2]</w:t>
       </w:r>
       <w:r>
         <w:t xml:space="preserve">. TTM operating margin through Q1 2026 reads 6.91%</w:t>
@@ -3134,7 +3134,7 @@
         <w:t xml:space="preserve"> </w:t>
       </w:r>
       <w:r>
-        <w:t xml:space="preserve">[T1 — workstream_d §1]</w:t>
+        <w:t xml:space="preserve">[T1 — Valuation §1]</w:t>
       </w:r>
       <w:r>
         <w:t xml:space="preserve">.</w:t>
@@ -3302,7 +3302,7 @@
         <w:t xml:space="preserve"> </w:t>
       </w:r>
       <w:r>
-        <w:t xml:space="preserve">[T1 — workstream_d §1; 10-Q 2026-03-31]</w:t>
+        <w:t xml:space="preserve">[T1 — Valuation §1; 10-Q 2026-03-31]</w:t>
       </w:r>
       <w:r>
         <w:t xml:space="preserve">. Reported enterprise value of $90.4bn carries a $6.9bn premium to market cap that reflects the Mercado Pago funding and deposits liability footprint, not net financial debt. This wedge is the most important reconciliation item in the financial model: EV-based multiples understate "cleanness" relative to the equity-bridge view.</w:t>
@@ -3329,7 +3329,7 @@
         <w:t xml:space="preserve"> </w:t>
       </w:r>
       <w:r>
-        <w:t xml:space="preserve">[T1 — workstream_d §1]</w:t>
+        <w:t xml:space="preserve">[T1 — Valuation §1]</w:t>
       </w:r>
       <w:r>
         <w:t xml:space="preserve">. A normalised operating-FCF view stripping float would land closer to</w:t>
@@ -3354,7 +3354,7 @@
         <w:t xml:space="preserve"> </w:t>
       </w:r>
       <w:r>
-        <w:t xml:space="preserve">[inference — workstream_d §1]</w:t>
+        <w:t xml:space="preserve">[inference — Valuation §1]</w:t>
       </w:r>
       <w:r>
         <w:t xml:space="preserve">.</w:t>
@@ -3381,7 +3381,7 @@
         <w:t xml:space="preserve"> </w:t>
       </w:r>
       <w:r>
-        <w:t xml:space="preserve">[T1 — workstream_e/earnings-transcripts]</w:t>
+        <w:t xml:space="preserve">[T1 — Earnings Transcripts]</w:t>
       </w:r>
       <w:r>
         <w:t xml:space="preserve">. CFO Martín de los Santos has been the consistent voice on the calls. Incoming-CEO Szarfsztejn does not appear in available Q2/Q3 2025 excerpts; his Q1 2026 earnings-call commentary is the first opportunity to read his quarterly posture.</w:t>
@@ -3440,7 +3440,7 @@
         <w:t xml:space="preserve"> </w:t>
       </w:r>
       <w:r>
-        <w:t xml:space="preserve">[partial-T1 — workstream_e §verbatim-signal; Q2-25 10-Q anchors pending]</w:t>
+        <w:t xml:space="preserve">[partial-T1 — Earnings Transcripts §verbatim-signal; Q2-25 10-Q anchors pending]</w:t>
       </w:r>
       <w:r>
         <w:t xml:space="preserve">. Mexico GMV "accelerated sharply" with items sold at the "fastest pace in almost 2 years." Unambiguous, superlative-laden statements — not hedged.</w:t>
@@ -3467,7 +3467,7 @@
         <w:t xml:space="preserve"> </w:t>
       </w:r>
       <w:r>
-        <w:t xml:space="preserve">[T1 — workstream_e §tone]</w:t>
+        <w:t xml:space="preserve">[T1 — Earnings Transcripts §tone]</w:t>
       </w:r>
       <w:r>
         <w:t xml:space="preserve">; the cultural pattern is qualitative-only forward commentary. Adversarial flags from the transcript: (i) AI attribution gap — management invokes ML in credit, ads, search, and logistics but no verbatim quote isolates AI's contribution to margin or take-rate; (ii) peak-cycle superlatives stacked in one quarter warrants watching whether Q4 2025 sustains (Q4 +45% YoY suggests yes); (iii) CEO-transition silence — Szarfsztejn does not appear in surfaced excerpts; (iv) no downside-scenario credit language — only positive asset-quality framing, itself a tell in a high-growth LatAm credit book.</w:t>
@@ -3504,7 +3504,7 @@
         <w:t xml:space="preserve"> </w:t>
       </w:r>
       <w:r>
-        <w:t xml:space="preserve">[T2 — workstream_h §bottom-line]</w:t>
+        <w:t xml:space="preserve">[T2 — Investor Sentiment §bottom-line]</w:t>
       </w:r>
       <w:r>
         <w:t xml:space="preserve"> </w:t>
@@ -3516,7 +3516,7 @@
         <w:t xml:space="preserve"> </w:t>
       </w:r>
       <w:r>
-        <w:t xml:space="preserve">[T2 — workstream_h]</w:t>
+        <w:t xml:space="preserve">[T2 — Investor Sentiment]</w:t>
       </w:r>
       <w:r>
         <w:t xml:space="preserve">. Short interest is reportedly low and declining</w:t>
@@ -3614,7 +3614,7 @@
         <w:t xml:space="preserve"> </w:t>
       </w:r>
       <w:r>
-        <w:t xml:space="preserve">[T1 — workstream_d §1; EODHD highlights 2026-05-28]</w:t>
+        <w:t xml:space="preserve">[T1 — Valuation §1; EODHD highlights 2026-05-28]</w:t>
       </w:r>
       <w:r>
         <w:t xml:space="preserve">. The 52-week range is</w:t>
@@ -3652,7 +3652,7 @@
         <w:t xml:space="preserve"> </w:t>
       </w:r>
       <w:r>
-        <w:t xml:space="preserve">[T2 — workstream_d §1; EODHD Technicals]</w:t>
+        <w:t xml:space="preserve">[T2 — Valuation §1; EODHD Technicals]</w:t>
       </w:r>
       <w:r>
         <w:t xml:space="preserve">.</w:t>
@@ -4558,7 +4558,7 @@
         <w:t xml:space="preserve"> </w:t>
       </w:r>
       <w:r>
-        <w:t xml:space="preserve">[T1 — workstream_d §3]</w:t>
+        <w:t xml:space="preserve">[T1 — Valuation §3]</w:t>
       </w:r>
       <w:r>
         <w:t xml:space="preserve">.</w:t>
@@ -6586,7 +6586,7 @@
         <w:t xml:space="preserve"> </w:t>
       </w:r>
       <w:r>
-        <w:t xml:space="preserve">[T3 — workstream_d §reverse-DCF]</w:t>
+        <w:t xml:space="preserve">[T3 — Valuation §reverse-DCF]</w:t>
       </w:r>
       <w:r>
         <w:t xml:space="preserve">. At WACC = 12% the same price embeds 15% revenue CAGR — undemanding. At WACC = 15% the price embeds &gt;25% revenue CAGR — demanding.</w:t>
@@ -7235,7 +7235,7 @@
         <w:t xml:space="preserve"> </w:t>
       </w:r>
       <w:r>
-        <w:t xml:space="preserve">[T1 — workstream_b §moat]</w:t>
+        <w:t xml:space="preserve">[T1 — Competitor Analysis §moat]</w:t>
       </w:r>
       <w:r>
         <w:t xml:space="preserve">. Twenty-six years of compounded build-out is not replicable by a single competitor in a single quarter.</w:t>
@@ -7280,7 +7280,7 @@
         <w:t xml:space="preserve"> </w:t>
       </w:r>
       <w:r>
-        <w:t xml:space="preserve">[T1 — workstream_d §1]</w:t>
+        <w:t xml:space="preserve">[T1 — Valuation §1]</w:t>
       </w:r>
       <w:r>
         <w:t xml:space="preserve"> </w:t>
@@ -7315,7 +7315,7 @@
         <w:t xml:space="preserve"> </w:t>
       </w:r>
       <w:r>
-        <w:t xml:space="preserve">[T1 — workstream_d §2; 10-Q 2026-05-08]</w:t>
+        <w:t xml:space="preserve">[T1 — Valuation §2; 10-Q 2026-05-08]</w:t>
       </w:r>
       <w:r>
         <w:t xml:space="preserve">. It is the strongest YoY revenue print since Q2 2022. If sustained through Q2 and Q3 2026, the bull-case scenario probability re-rates from 25% to ~40%, the probability-weighted intrinsic moves from $1,632 to ~$1,925, and the margin-of-safety wedge to the prevailing $1,648 price opens up enough to justify a full position.</w:t>
@@ -7336,7 +7336,7 @@
         <w:t xml:space="preserve"> </w:t>
       </w:r>
       <w:r>
-        <w:t xml:space="preserve">[T2 — workstream_c §founder-transition]</w:t>
+        <w:t xml:space="preserve">[T2 — People &amp; Culture §founder-transition]</w:t>
       </w:r>
       <w:r>
         <w:t xml:space="preserve">. Founder voluntarily handed off; internal CEO has a 9-year tenure including the Mercado Envíos build-out; bench is unusually long-tenured. The transition risk is real but compressed into the next four quarters of execution.</w:t>
@@ -7357,7 +7357,7 @@
         <w:t xml:space="preserve"> </w:t>
       </w:r>
       <w:r>
-        <w:t xml:space="preserve">[T2 — workstream_d §1]</w:t>
+        <w:t xml:space="preserve">[T2 — Valuation §1]</w:t>
       </w:r>
       <w:r>
         <w:t xml:space="preserve">. MELI is 38% below its 12-month high and 19% below its 200-DMA. The peak Mag-7-style multiple has compressed. We are buying into a corrected price, not a peak.</w:t>
@@ -7394,7 +7394,7 @@
         <w:t xml:space="preserve"> </w:t>
       </w:r>
       <w:r>
-        <w:t xml:space="preserve">[T1 — cross_red_flags §RF-DISC-006]</w:t>
+        <w:t xml:space="preserve">[T1 — Red Flags §RF-DISC-006]</w:t>
       </w:r>
       <w:r>
         <w:t xml:space="preserve">.</w:t>
@@ -7462,7 +7462,7 @@
         <w:t xml:space="preserve"> </w:t>
       </w:r>
       <w:r>
-        <w:t xml:space="preserve">[T1 — workstream_d §6]</w:t>
+        <w:t xml:space="preserve">[T1 — Valuation §6]</w:t>
       </w:r>
       <w:r>
         <w:t xml:space="preserve">. The +49% Q1 print materially raises probability mass on this path.</w:t>
@@ -7552,7 +7552,7 @@
         <w:t xml:space="preserve"> </w:t>
       </w:r>
       <w:r>
-        <w:t xml:space="preserve">[T2 — workstream_g §bull-framing]</w:t>
+        <w:t xml:space="preserve">[T2 — Analyst Coverage §bull-framing]</w:t>
       </w:r>
       <w:r>
         <w:t xml:space="preserve">. Our base case adopts a similar trajectory but with a slower margin recovery path (FY26 10.9% → FY30 16.0%) and a slightly heavier bear-case probability weighting. The sell-side bull framing is engaged, not silently inherited.</w:t>
@@ -7579,7 +7579,7 @@
         <w:t xml:space="preserve"> </w:t>
       </w:r>
       <w:r>
-        <w:t xml:space="preserve">[T1 — workstream_d §2]</w:t>
+        <w:t xml:space="preserve">[T1 — Valuation §2]</w:t>
       </w:r>
       <w:r>
         <w:t xml:space="preserve">. The framing is plausible. But it has now been running for three full years; the market is 38% below the 12-month high precisely because investors are voting that the reinvestment is not buying the durability that management implies. We engage the framing explicitly: the partner discussion in §12 must ask how many more "deliberate reinvestment" years are tolerable before the multiple re-rates downward.</w:t>
@@ -7610,7 +7610,7 @@
         <w:t xml:space="preserve"> </w:t>
       </w:r>
       <w:r>
-        <w:t xml:space="preserve">[T1 — cross_red_flags §RF-ACCT-001]</w:t>
+        <w:t xml:space="preserve">[T1 — Red Flags §RF-ACCT-001]</w:t>
       </w:r>
       <w:r>
         <w:t xml:space="preserve">.</w:t>
@@ -7631,7 +7631,7 @@
         <w:t xml:space="preserve"> </w:t>
       </w:r>
       <w:r>
-        <w:t xml:space="preserve">[T1 — workstream_b §war-game; workstream_d §6 bear]</w:t>
+        <w:t xml:space="preserve">[T1 — Competitor Analysis §war-game; Valuation §6 bear]</w:t>
       </w:r>
       <w:r>
         <w:t xml:space="preserve">.</w:t>
@@ -7652,7 +7652,7 @@
         <w:t xml:space="preserve"> </w:t>
       </w:r>
       <w:r>
-        <w:t xml:space="preserve">[T1 — workstream_d §9]</w:t>
+        <w:t xml:space="preserve">[T1 — Valuation §9]</w:t>
       </w:r>
       <w:r>
         <w:t xml:space="preserve">.</w:t>
@@ -7673,7 +7673,7 @@
         <w:t xml:space="preserve"> </w:t>
       </w:r>
       <w:r>
-        <w:t xml:space="preserve">[T1 — cross_red_flags §RF-DISC-006]</w:t>
+        <w:t xml:space="preserve">[T1 — Red Flags §RF-DISC-006]</w:t>
       </w:r>
       <w:r>
         <w:t xml:space="preserve">.</w:t>
@@ -7694,7 +7694,7 @@
         <w:t xml:space="preserve"> </w:t>
       </w:r>
       <w:r>
-        <w:t xml:space="preserve">[T1 — workstream_d §2; cross_red_flags §RF-ACCT-006]</w:t>
+        <w:t xml:space="preserve">[T1 — Valuation §2; Red Flags §RF-ACCT-006]</w:t>
       </w:r>
       <w:r>
         <w:t xml:space="preserve">.</w:t>
@@ -7765,7 +7765,7 @@
         <w:t xml:space="preserve"> </w:t>
       </w:r>
       <w:r>
-        <w:t xml:space="preserve">[T1 — workstream_d §6]</w:t>
+        <w:t xml:space="preserve">[T1 — Valuation §6]</w:t>
       </w:r>
     </w:p>
     <w:p>
@@ -7837,7 +7837,7 @@
         <w:t xml:space="preserve"> </w:t>
       </w:r>
       <w:r>
-        <w:t xml:space="preserve">[T1 — workstream_d §9; workstream_b §war-game]</w:t>
+        <w:t xml:space="preserve">[T1 — Valuation §9; Competitor Analysis §war-game]</w:t>
       </w:r>
     </w:p>
     <w:bookmarkEnd w:id="67"/>
@@ -7893,7 +7893,7 @@
         <w:t xml:space="preserve"> </w:t>
       </w:r>
       <w:r>
-        <w:t xml:space="preserve">[T1 — cross_red_flags §RF-DISC-006]</w:t>
+        <w:t xml:space="preserve">[T1 — Red Flags §RF-DISC-006]</w:t>
       </w:r>
     </w:p>
     <w:bookmarkEnd w:id="68"/>
@@ -7949,7 +7949,7 @@
         <w:t xml:space="preserve"> </w:t>
       </w:r>
       <w:r>
-        <w:t xml:space="preserve">[T1 — workstream_d §9; workstream_b §regulatory]</w:t>
+        <w:t xml:space="preserve">[T1 — Valuation §9; Competitor Analysis §regulatory]</w:t>
       </w:r>
     </w:p>
     <w:bookmarkEnd w:id="69"/>
@@ -8005,7 +8005,7 @@
         <w:t xml:space="preserve"> </w:t>
       </w:r>
       <w:r>
-        <w:t xml:space="preserve">[T1 — workstream_d §9; workstream_c]</w:t>
+        <w:t xml:space="preserve">[T1 — Valuation §9; People &amp; Culture]</w:t>
       </w:r>
     </w:p>
     <w:bookmarkEnd w:id="70"/>
@@ -8061,7 +8061,7 @@
         <w:t xml:space="preserve"> </w:t>
       </w:r>
       <w:r>
-        <w:t xml:space="preserve">[T1 — workstream_d §9; workstream_e]</w:t>
+        <w:t xml:space="preserve">[T1 — Valuation §9; Primary Filings / Earnings Transcripts]</w:t>
       </w:r>
     </w:p>
     <w:bookmarkEnd w:id="71"/>
@@ -8117,7 +8117,7 @@
         <w:t xml:space="preserve"> </w:t>
       </w:r>
       <w:r>
-        <w:t xml:space="preserve">[T1 — workstream_d §2; cross_red_flags §RF-ACCT-006]</w:t>
+        <w:t xml:space="preserve">[T1 — Valuation §2; Red Flags §RF-ACCT-006]</w:t>
       </w:r>
     </w:p>
     <w:bookmarkEnd w:id="72"/>
@@ -8173,7 +8173,7 @@
         <w:t xml:space="preserve"> </w:t>
       </w:r>
       <w:r>
-        <w:t xml:space="preserve">[T1 — workstream_d §1]</w:t>
+        <w:t xml:space="preserve">[T1 — Valuation §1]</w:t>
       </w:r>
     </w:p>
     <w:bookmarkEnd w:id="73"/>
@@ -8197,7 +8197,7 @@
         <w:t xml:space="preserve"> </w:t>
       </w:r>
       <w:r>
-        <w:t xml:space="preserve">[T1 — cross_red_flags §cleared]</w:t>
+        <w:t xml:space="preserve">[T1 — Red Flags §cleared]</w:t>
       </w:r>
     </w:p>
     <w:bookmarkEnd w:id="74"/>
@@ -8730,7 +8730,7 @@
         <w:t xml:space="preserve"> </w:t>
       </w:r>
       <w:r>
-        <w:t xml:space="preserve">[T2 — workstream_c §board]</w:t>
+        <w:t xml:space="preserve">[T2 — People &amp; Culture §board]</w:t>
       </w:r>
       <w:r>
         <w:t xml:space="preserve">.</w:t>
@@ -8771,7 +8771,7 @@
         <w:t xml:space="preserve"> </w:t>
       </w:r>
       <w:r>
-        <w:t xml:space="preserve">[T3 — workstream_c]</w:t>
+        <w:t xml:space="preserve">[T3 — People &amp; Culture]</w:t>
       </w:r>
       <w:r>
         <w:t xml:space="preserve">.</w:t>
@@ -8812,7 +8812,7 @@
         <w:t xml:space="preserve"> </w:t>
       </w:r>
       <w:r>
-        <w:t xml:space="preserve">[T1 — cross_red_flags §RF-RP-001]</w:t>
+        <w:t xml:space="preserve">[T1 — Red Flags §RF-RP-001]</w:t>
       </w:r>
       <w:r>
         <w:t xml:space="preserve">.</w:t>
@@ -8843,7 +8843,7 @@
         <w:t xml:space="preserve"> </w:t>
       </w:r>
       <w:r>
-        <w:t xml:space="preserve">[T1 — cross_red_flags §RF-GOV-002]</w:t>
+        <w:t xml:space="preserve">[T1 — Red Flags §RF-GOV-002]</w:t>
       </w:r>
       <w:r>
         <w:t xml:space="preserve">.</w:t>
@@ -8874,7 +8874,7 @@
         <w:t xml:space="preserve"> </w:t>
       </w:r>
       <w:r>
-        <w:t xml:space="preserve">[T1 — cross_red_flags §RF-GOV-001]</w:t>
+        <w:t xml:space="preserve">[T1 — Red Flags §RF-GOV-001]</w:t>
       </w:r>
       <w:r>
         <w:t xml:space="preserve">.</w:t>
@@ -8905,7 +8905,7 @@
         <w:t xml:space="preserve"> </w:t>
       </w:r>
       <w:r>
-        <w:t xml:space="preserve">[T2 — workstream_c §board]</w:t>
+        <w:t xml:space="preserve">[T2 — People &amp; Culture §board]</w:t>
       </w:r>
       <w:r>
         <w:t xml:space="preserve">.</w:t>
@@ -8932,7 +8932,7 @@
         <w:t xml:space="preserve"> </w:t>
       </w:r>
       <w:r>
-        <w:t xml:space="preserve">[T1 — cross_red_flags §RF-GOV-012]</w:t>
+        <w:t xml:space="preserve">[T1 — Red Flags §RF-GOV-012]</w:t>
       </w:r>
       <w:r>
         <w:t xml:space="preserve">. No going-concern language flagged. No auditor change in last 3 years identified.</w:t>
@@ -8957,7 +8957,7 @@
         <w:t xml:space="preserve"> </w:t>
       </w:r>
       <w:r>
-        <w:t xml:space="preserve">[T1 — cross_red_flags §RF-AUD-001; substrate gap]</w:t>
+        <w:t xml:space="preserve">[T1 — Red Flags §RF-AUD-001; substrate gap]</w:t>
       </w:r>
       <w:r>
         <w:t xml:space="preserve">.</w:t>
@@ -8984,7 +8984,7 @@
         <w:t xml:space="preserve"> </w:t>
       </w:r>
       <w:r>
-        <w:t xml:space="preserve">[T3 — workstream_c §compensation]</w:t>
+        <w:t xml:space="preserve">[T3 — People &amp; Culture §compensation]</w:t>
       </w:r>
       <w:r>
         <w:t xml:space="preserve">. Founder Galperín's direct economic ownership and voting position is not crisply stated in the 2026 sources read in this pass</w:t>
@@ -9029,7 +9029,7 @@
         <w:t xml:space="preserve"> </w:t>
       </w:r>
       <w:r>
-        <w:t xml:space="preserve">[T1 — workstream_b §regulatory]</w:t>
+        <w:t xml:space="preserve">[T1 — Competitor Analysis §regulatory]</w:t>
       </w:r>
       <w:r>
         <w:t xml:space="preserve">. No publicly-named ESG dispute or activist-investor campaign identified in current corpus. Strategic posture toward LatAm consumer access is consistent with a constructive social ESG read</w:t>
@@ -9038,7 +9038,7 @@
         <w:t xml:space="preserve"> </w:t>
       </w:r>
       <w:r>
-        <w:t xml:space="preserve">[inference — workstream_a]</w:t>
+        <w:t xml:space="preserve">[inference — Company History / AI Unit Economics]</w:t>
       </w:r>
       <w:r>
         <w:t xml:space="preserve">.</w:t>
@@ -9055,7 +9055,7 @@
         <w:t xml:space="preserve"> </w:t>
       </w:r>
       <w:r>
-        <w:t xml:space="preserve">[T1 — cross_red_flags §RF-OPS-001]</w:t>
+        <w:t xml:space="preserve">[T1 — Red Flags §RF-OPS-001]</w:t>
       </w:r>
       <w:r>
         <w:t xml:space="preserve">.</w:t>
@@ -9349,7 +9349,7 @@
         <w:t xml:space="preserve"> </w:t>
       </w:r>
       <w:r>
-        <w:t xml:space="preserve">[T1 — cross_red_flags §RF-AUD-001]</w:t>
+        <w:t xml:space="preserve">[T1 — Red Flags §RF-AUD-001]</w:t>
       </w:r>
     </w:p>
     <w:p>
@@ -9421,7 +9421,7 @@
         <w:t xml:space="preserve"> </w:t>
       </w:r>
       <w:r>
-        <w:t xml:space="preserve">[T1 — cross_red_flags §RF-GOV-001]</w:t>
+        <w:t xml:space="preserve">[T1 — Red Flags §RF-GOV-001]</w:t>
       </w:r>
     </w:p>
     <w:p>
@@ -9449,7 +9449,7 @@
         <w:t xml:space="preserve"> </w:t>
       </w:r>
       <w:r>
-        <w:t xml:space="preserve">[T1 — cross_red_flags §RF-CAP-004]</w:t>
+        <w:t xml:space="preserve">[T1 — Red Flags §RF-CAP-004]</w:t>
       </w:r>
     </w:p>
     <w:p>

</xml_diff>